<commit_message>
Sort Symlinks on Windows (#1)
* remove practical numbering

* symlink added from windows

* Copy Windows symlink into Y2 folder

* symlink added from windows to Y2 HC

* Delete HC symlinks

* symlink added to Y2 HC

* Add Kinetics symlink

* Update permissions message

* Remove plot2.py symlink, create test.py symlinks

* Add README, update fix_symlinks to inlcude test.py

* Add home directory test.py

---------

Co-authored-by: David Pugh <david.pugh@york.ac.uk>
</commit_message>
<xml_diff>
--- a/Y3_Photometer/Photometer practical lab script.docx
+++ b/Y3_Photometer/Photometer practical lab script.docx
@@ -9,7 +9,7 @@
       <w:bookmarkStart w:id="0" w:name="_Toc145065575"/>
       <w:bookmarkStart w:id="1" w:name="_Toc208388585"/>
       <w:r>
-        <w:t>ART5: Building and Calibrating a Photometer</w:t>
+        <w:t>Building and Calibrating a Photometer</w:t>
       </w:r>
       <w:bookmarkEnd w:id="0"/>
       <w:bookmarkEnd w:id="1"/>
@@ -32,12 +32,36 @@
     </w:p>
     <w:p>
       <w:r>
-        <w:t>Pretty much all sensors, ultimately result in providing a voltage output, which is how we measure the variation. This may be directly a voltage output from the sensor, or we may first convert a related unit into a voltage. In this photometer, we will be using a photodiode. When light (photons) react the photodiode, this generates a current, and it is normal practice to then convert this current (and in the process amplifying it) into a voltage which we can measure.</w:t>
-      </w:r>
-    </w:p>
-    <w:p>
-      <w:r>
-        <w:t>The generated voltage can easily be measured using a voltmeter (often as part of a multimeter), which is what you will use here. However, it is a relatively easy step to input a voltage into a data acquisition device (DAQ) in order to connect the sensor (or multiple sensors) to a computer to allow for automated measurement. These measurements could be very fast, maybe making many measurements over a millisecond timescale (for example to measure stopped-flow kinetics), or over a prolonged period (e.g. every minute over a year for climate recording).</w:t>
+        <w:t xml:space="preserve">Pretty much all sensors, ultimately result in providing a voltage output, which is how we measure the variation. This may be directly a voltage output from the sensor, or we may first convert a related unit into a voltage. In this photometer, we will be using a photodiode. When light (photons) </w:t>
+      </w:r>
+      <w:proofErr w:type="gramStart"/>
+      <w:r>
+        <w:t>react</w:t>
+      </w:r>
+      <w:proofErr w:type="gramEnd"/>
+      <w:r>
+        <w:t xml:space="preserve"> the photodiode, this generates a current, and it is normal practice to then convert this current (and in the process amplifying it) into a voltage which we can measure.</w:t>
+      </w:r>
+    </w:p>
+    <w:p>
+      <w:r>
+        <w:t xml:space="preserve">The generated voltage can easily be measured using a voltmeter (often as part of a </w:t>
+      </w:r>
+      <w:proofErr w:type="spellStart"/>
+      <w:r>
+        <w:t>multimeter</w:t>
+      </w:r>
+      <w:proofErr w:type="spellEnd"/>
+      <w:r>
+        <w:t>), which is what you will use here. However, it is a relatively easy step to input a voltage into a data acquisition device (DAQ) in order to connect the sensor (or multiple sensors) to a computer to allow for automated measurement. These measurements could be very fast, maybe making many measurements over a millisecond timescale (for example to measure stopped-flow kinetics), or over a prolonged period (</w:t>
+      </w:r>
+      <w:proofErr w:type="gramStart"/>
+      <w:r>
+        <w:t>e.g.</w:t>
+      </w:r>
+      <w:proofErr w:type="gramEnd"/>
+      <w:r>
+        <w:t xml:space="preserve"> every minute over a year for climate recording).</w:t>
       </w:r>
     </w:p>
     <w:p>
@@ -1022,7 +1046,15 @@
     </w:p>
     <w:p>
       <w:r>
-        <w:t xml:space="preserve">An electrical current is the flow of charge around a circuit. The charge is carried by electrons (e.g. in wires) or ions (e.g. in solutions). Current intensity, the rate of flow of charge, is represented using the symbol </w:t>
+        <w:t>An electrical current is the flow of charge around a circuit. The charge is carried by electrons (</w:t>
+      </w:r>
+      <w:proofErr w:type="gramStart"/>
+      <w:r>
+        <w:t>e.g.</w:t>
+      </w:r>
+      <w:proofErr w:type="gramEnd"/>
+      <w:r>
+        <w:t xml:space="preserve"> in wires) or ions (e.g. in solutions). Current intensity, the rate of flow of charge, is represented using the symbol </w:t>
       </w:r>
       <w:r>
         <w:rPr>
@@ -1076,7 +1108,15 @@
     </w:p>
     <w:p>
       <w:r>
-        <w:t>Alternating current: the direction of current flow oscillates (alternates) continuously (e.g. mains wiring has an oscillation frequency of 50 Hz). This is given the symbol ~.</w:t>
+        <w:t>Alternating current: the direction of current flow oscillates (alternates) continuously (</w:t>
+      </w:r>
+      <w:proofErr w:type="gramStart"/>
+      <w:r>
+        <w:t>e.g.</w:t>
+      </w:r>
+      <w:proofErr w:type="gramEnd"/>
+      <w:r>
+        <w:t xml:space="preserve"> mains wiring has an oscillation frequency of 50 Hz). This is given the symbol ~.</w:t>
       </w:r>
     </w:p>
     <w:p>
@@ -1115,7 +1155,15 @@
     </w:p>
     <w:p>
       <w:r>
-        <w:t>In the water system analogy the voltage can be considered as the pressure of water in the pipe, with a higher pressure giving more energy to the system.</w:t>
+        <w:t xml:space="preserve">In the water system </w:t>
+      </w:r>
+      <w:proofErr w:type="gramStart"/>
+      <w:r>
+        <w:t>analogy</w:t>
+      </w:r>
+      <w:proofErr w:type="gramEnd"/>
+      <w:r>
+        <w:t xml:space="preserve"> the voltage can be considered as the pressure of water in the pipe, with a higher pressure giving more energy to the system.</w:t>
       </w:r>
     </w:p>
     <w:p>
@@ -1152,7 +1200,15 @@
     </w:p>
     <w:p>
       <w:r>
-        <w:t>In the water system analogy, resistance can be considered as a constriction in the pipe. The energy available is reduced after the constriction (i.e. there is a drop in the voltage).</w:t>
+        <w:t>In the water system analogy, resistance can be considered as a constriction in the pipe. The energy available is reduced after the constriction (</w:t>
+      </w:r>
+      <w:proofErr w:type="gramStart"/>
+      <w:r>
+        <w:t>i.e.</w:t>
+      </w:r>
+      <w:proofErr w:type="gramEnd"/>
+      <w:r>
+        <w:t xml:space="preserve"> there is a drop in the voltage).</w:t>
       </w:r>
     </w:p>
     <w:p>
@@ -1165,7 +1221,15 @@
     </w:p>
     <w:p>
       <w:r>
-        <w:t>Current, resistance and voltage often have a direct relationship between one another in many materials. If components obey this law they are called Ohmic materials. Most of the components you are using obey this relationship. The relationship is:</w:t>
+        <w:t xml:space="preserve">Current, resistance and voltage often have a direct relationship between one another in many materials. If components obey this </w:t>
+      </w:r>
+      <w:proofErr w:type="gramStart"/>
+      <w:r>
+        <w:t>law</w:t>
+      </w:r>
+      <w:proofErr w:type="gramEnd"/>
+      <w:r>
+        <w:t xml:space="preserve"> they are called Ohmic materials. Most of the components you are using obey this relationship. The relationship is:</w:t>
       </w:r>
     </w:p>
     <w:p>
@@ -1190,7 +1254,15 @@
     </w:p>
     <w:p>
       <w:r>
-        <w:t>In electrical circuitry, the anode is the positively charged terminal of a component or power source. It is usual when connecting wires to components that red wire is used to signify the anode. Electrons flow around the circuit to the anode (negative charge flows to the positive terminal).</w:t>
+        <w:t xml:space="preserve">In electrical circuitry, the anode is the positively charged terminal of a component or power source. It is usual when connecting wires to components that red </w:t>
+      </w:r>
+      <w:proofErr w:type="spellStart"/>
+      <w:r>
+        <w:t>wire</w:t>
+      </w:r>
+      <w:proofErr w:type="spellEnd"/>
+      <w:r>
+        <w:t xml:space="preserve"> is used to signify the anode. Electrons flow around the circuit to the anode (negative charge flows to the positive terminal).</w:t>
       </w:r>
     </w:p>
     <w:p>
@@ -1296,11 +1368,19 @@
           <w:rFonts w:eastAsiaTheme="minorEastAsia"/>
         </w:rPr>
       </w:pPr>
+      <w:proofErr w:type="gramStart"/>
       <w:r>
         <w:rPr>
           <w:rFonts w:eastAsiaTheme="minorEastAsia"/>
         </w:rPr>
-        <w:t xml:space="preserve">Where </w:t>
+        <w:t>Where</w:t>
+      </w:r>
+      <w:proofErr w:type="gramEnd"/>
+      <w:r>
+        <w:rPr>
+          <w:rFonts w:eastAsiaTheme="minorEastAsia"/>
+        </w:rPr>
+        <w:t xml:space="preserve"> </w:t>
       </w:r>
     </w:p>
     <w:p>
@@ -1620,6 +1700,7 @@
       <w:r>
         <w:t>However, this assumes that the output from the circuit is 0 V when no light is present in the photometer, which may not be true. A correction to the equation which subtracts the voltage at zero light (</w:t>
       </w:r>
+      <w:proofErr w:type="spellStart"/>
       <w:r>
         <w:rPr>
           <w:rFonts w:ascii="Times New Roman" w:hAnsi="Times New Roman" w:cs="Times New Roman"/>
@@ -1635,6 +1716,7 @@
         </w:rPr>
         <w:t>zero</w:t>
       </w:r>
+      <w:proofErr w:type="spellEnd"/>
       <w:r>
         <w:t>) can be made to give an overall equation for transmission (</w:t>
       </w:r>
@@ -2407,7 +2489,23 @@
                 <w:sz w:val="20"/>
                 <w:szCs w:val="20"/>
               </w:rPr>
-              <w:t>A type of diode that also generates light when current is applied in the forward direction. LEDs are made from inorganic semi-conductors. For example the green LED used in this experiment is a Gallium(III) phosphide.</w:t>
+              <w:t xml:space="preserve">A type of diode that also generates light when current is applied in the forward direction. LEDs are made from inorganic semi-conductors. For example the green LED used in this experiment is a </w:t>
+            </w:r>
+            <w:proofErr w:type="gramStart"/>
+            <w:r>
+              <w:rPr>
+                <w:sz w:val="20"/>
+                <w:szCs w:val="20"/>
+              </w:rPr>
+              <w:t>Gallium(</w:t>
+            </w:r>
+            <w:proofErr w:type="gramEnd"/>
+            <w:r>
+              <w:rPr>
+                <w:sz w:val="20"/>
+                <w:szCs w:val="20"/>
+              </w:rPr>
+              <w:t>III) phosphide.</w:t>
             </w:r>
           </w:p>
         </w:tc>
@@ -2911,6 +3009,7 @@
               </w:rPr>
               <w:t xml:space="preserve">A resistor is a device to limit current flow or lower voltages in a circuit. For </w:t>
             </w:r>
+            <w:proofErr w:type="gramStart"/>
             <w:r>
               <w:rPr>
                 <w:sz w:val="20"/>
@@ -2918,6 +3017,7 @@
               </w:rPr>
               <w:t>example</w:t>
             </w:r>
+            <w:proofErr w:type="gramEnd"/>
             <w:r>
               <w:rPr>
                 <w:sz w:val="20"/>
@@ -3449,7 +3549,17 @@
     </w:p>
     <w:p>
       <w:r>
-        <w:t>The stripboard consists of rows of copper tape with gaps between. Anything connected by the tinned copper strips is electrically connected, but the individual rows are isolated from each other. Each row needs to be constructed so that there is a separate wire going to each leg of the two components. It is wise to follow the colour conventions for wiring. An example is shown below (the LED is depicted in green to aid identification). It is advisable to use quite long sections of wire (eg 30 cm) for each connection and label them.</w:t>
+        <w:t>The stripboard consists of rows of copper tape with gaps between. Anything connected by the tinned copper strips is electrically connected, but the individual rows are isolated from each other. Each row needs to be constructed so that there is a separate wire going to each leg of the two components. It is wise to follow the colour conventions for wiring. An example is shown below (the LED is depicted in green to aid identification). It is advisable to use quite long sections of wire (</w:t>
+      </w:r>
+      <w:proofErr w:type="spellStart"/>
+      <w:proofErr w:type="gramStart"/>
+      <w:r>
+        <w:t>eg</w:t>
+      </w:r>
+      <w:proofErr w:type="spellEnd"/>
+      <w:proofErr w:type="gramEnd"/>
+      <w:r>
+        <w:t xml:space="preserve"> 30 cm) for each connection and label them.</w:t>
       </w:r>
     </w:p>
     <w:p/>
@@ -3573,7 +3683,15 @@
     </w:p>
     <w:p>
       <w:r>
-        <w:t>Breadboards are used for rapid prototyping of circuits as it is easy to change components and doesn’t involve needing to solder/desolder each time. Breadboards consist of a large number of sockets where the sockets in each row are electrically connected, but are isolated from the other rows. The gap in the centre (between columns E and F) is also an insulator and allows integrated circuit chips to be used with the board.</w:t>
+        <w:t>Breadboards are used for rapid prototyping of circuits as it is easy to change components and doesn’t involve needing to solder/</w:t>
+      </w:r>
+      <w:proofErr w:type="spellStart"/>
+      <w:r>
+        <w:t>desolder</w:t>
+      </w:r>
+      <w:proofErr w:type="spellEnd"/>
+      <w:r>
+        <w:t xml:space="preserve"> each time. Breadboards consist of a large number of sockets where the sockets in each row are electrically connected, but are isolated from the other rows. The gap in the centre (between columns E and F) is also an insulator and allows integrated circuit chips to be used with the board.</w:t>
       </w:r>
     </w:p>
     <w:p>
@@ -3824,7 +3942,15 @@
     <w:p>
       <w:r>
         <w:lastRenderedPageBreak/>
-        <w:t>Different values of resistors are included in your packet of components. There are two ways to identify which resistor is which. In the appendices for this experiment there is a colour code chart for identifying resistor labelling and also information on using a multimeter to check resistor values.</w:t>
+        <w:t xml:space="preserve">Different values of resistors are included in your packet of components. There are two ways to identify which resistor is which. In the appendices for this experiment there is a colour code chart for identifying resistor labelling and also information on using a </w:t>
+      </w:r>
+      <w:proofErr w:type="spellStart"/>
+      <w:r>
+        <w:t>multimeter</w:t>
+      </w:r>
+      <w:proofErr w:type="spellEnd"/>
+      <w:r>
+        <w:t xml:space="preserve"> to check resistor values.</w:t>
       </w:r>
     </w:p>
     <w:p>
@@ -3842,7 +3968,17 @@
     </w:p>
     <w:p>
       <w:r>
-        <w:t>Next, you will need to construct an enclosure to protect your photometer from ambient light for when you are recording readings. Construct a cover (eg a box) that can exclude light from the stripboard section of your photometer. These can be constructed from the black card in the lab.</w:t>
+        <w:t>Next, you will need to construct an enclosure to protect your photometer from ambient light for when you are recording readings. Construct a cover (</w:t>
+      </w:r>
+      <w:proofErr w:type="spellStart"/>
+      <w:proofErr w:type="gramStart"/>
+      <w:r>
+        <w:t>eg</w:t>
+      </w:r>
+      <w:proofErr w:type="spellEnd"/>
+      <w:proofErr w:type="gramEnd"/>
+      <w:r>
+        <w:t xml:space="preserve"> a box) that can exclude light from the stripboard section of your photometer. These can be constructed from the black card in the lab.</w:t>
       </w:r>
     </w:p>
     <w:p>
@@ -3855,7 +3991,15 @@
     </w:p>
     <w:p>
       <w:r>
-        <w:t>As with commercially available spectrometers, your photometer will only work successfully within its limits of detection. The operational amplifier in your circuit receives a 5 V reference voltage which makes its limits of detection between 0 and 5 V. If your photometer is reading (or is close to 5 V), then it is at its limit of detection and will need adjusting to ensure that it remains on scale. Your reading for a cuvette of water wants to be in the 2-4 V range. There are two ways to adjust your photometer and you should be aware of both methods, although the first method is the one you should utilise in this experiment.</w:t>
+        <w:t xml:space="preserve">As with commercially available spectrometers, your photometer will only work successfully within its limits of detection. The operational amplifier in your circuit receives a 5 V reference voltage which makes its limits of detection between 0 and 5 V. If your photometer is reading (or is close to 5 V), then it is at its limit of detection and will need adjusting to ensure that it remains on scale. </w:t>
+      </w:r>
+      <w:proofErr w:type="gramStart"/>
+      <w:r>
+        <w:t>Your</w:t>
+      </w:r>
+      <w:proofErr w:type="gramEnd"/>
+      <w:r>
+        <w:t xml:space="preserve"> reading for a cuvette of water wants to be in the 2-4 V range. There are two ways to adjust your photometer and you should be aware of both methods, although the first method is the one you should utilise in this experiment.</w:t>
       </w:r>
     </w:p>
     <w:p>
@@ -3896,8 +4040,13 @@
       </w:r>
     </w:p>
     <w:p>
-      <w:r>
-        <w:t>KMnO₄ / mM: 0.40, 0.35, 0.30, 0.25, 0.20</w:t>
+      <w:proofErr w:type="spellStart"/>
+      <w:r>
+        <w:t>KMnO</w:t>
+      </w:r>
+      <w:proofErr w:type="spellEnd"/>
+      <w:r>
+        <w:t>₄ / mM: 0.40, 0.35, 0.30, 0.25, 0.20</w:t>
       </w:r>
     </w:p>
     <w:p>
@@ -3929,12 +4078,28 @@
     </w:p>
     <w:p>
       <w:r>
-        <w:t>At this stage, you have managed to build a working photometer, where we take measurements by reading the voltage using a multimeter. In order for a computer to ‘read’ these voltages, we make use of an ‘Analogue to Digital Converter’ (ADC or A2D) which converts the voltage into a number which is supplied to the computer.</w:t>
-      </w:r>
-    </w:p>
-    <w:p>
-      <w:r>
-        <w:t>There are many Data Acquisition Devices available which carry out this analogue to digital conversion of voltage using A2D converters. Different DAQs have varying numbers of  ADCs available on the DAQ  allowing multiple voltage sources to be read at the same time), as well as varying resolution (the level of voltage difference which can be differentiated), sampling rates (how quickly voltages changes can be measured) and voltage inputs (range of voltages to be measured). The prices of devices vary depending on these specifications from a few pounds to many thousands for a device.</w:t>
+        <w:t xml:space="preserve">At this stage, you have managed to build a working photometer, where we take measurements by reading the voltage using a </w:t>
+      </w:r>
+      <w:proofErr w:type="spellStart"/>
+      <w:r>
+        <w:t>multimeter</w:t>
+      </w:r>
+      <w:proofErr w:type="spellEnd"/>
+      <w:r>
+        <w:t>. In order for a computer to ‘read’ these voltages, we make use of an ‘Analogue to Digital Converter’ (ADC or A2D) which converts the voltage into a number which is supplied to the computer.</w:t>
+      </w:r>
+    </w:p>
+    <w:p>
+      <w:r>
+        <w:t xml:space="preserve">There are many Data Acquisition Devices available which carry out this analogue to digital conversion of voltage using A2D converters. Different DAQs have varying numbers </w:t>
+      </w:r>
+      <w:proofErr w:type="gramStart"/>
+      <w:r>
+        <w:t>of  ADCs</w:t>
+      </w:r>
+      <w:proofErr w:type="gramEnd"/>
+      <w:r>
+        <w:t xml:space="preserve"> available on the DAQ  allowing multiple voltage sources to be read at the same time), as well as varying resolution (the level of voltage difference which can be differentiated), sampling rates (how quickly voltages changes can be measured) and voltage inputs (range of voltages to be measured). The prices of devices vary depending on these specifications from a few pounds to many thousands for a device.</w:t>
       </w:r>
     </w:p>
     <w:p>
@@ -3963,7 +4128,25 @@
     </w:p>
     <w:p>
       <w:r>
-        <w:t>Resolution for ADCs is usually described as a number of bits, eg in the case of the Arduino Uno, these are 10-bit converters. This means that the voltage range (0 – 5 V) gets split into 2¹⁰ divisions (2¹⁰ = 1024), which means that voltages differences of approximately 0.005 V can be resolved (5 ÷ 1024), which is roughly the same resolution as the multimeter used in this practical. The voltage is converted into the corresponding numerical value which is what a computer can interpret, these values ranging from 0 (= 0 V) and 1023 (= 5 V).</w:t>
+        <w:t xml:space="preserve">Resolution for ADCs is usually described as a number of bits, </w:t>
+      </w:r>
+      <w:proofErr w:type="spellStart"/>
+      <w:proofErr w:type="gramStart"/>
+      <w:r>
+        <w:t>eg</w:t>
+      </w:r>
+      <w:proofErr w:type="spellEnd"/>
+      <w:proofErr w:type="gramEnd"/>
+      <w:r>
+        <w:t xml:space="preserve"> in the case of the Arduino Uno, these are 10-bit converters. This means that the voltage range (0 – 5 V) gets split into 2¹⁰ divisions (2¹⁰ = 1024), which means that voltages differences of approximately 0.005 V can be resolved (5 ÷ 1024), which is roughly the same resolution as the </w:t>
+      </w:r>
+      <w:proofErr w:type="spellStart"/>
+      <w:r>
+        <w:t>multimeter</w:t>
+      </w:r>
+      <w:proofErr w:type="spellEnd"/>
+      <w:r>
+        <w:t xml:space="preserve"> used in this practical. The voltage is converted into the corresponding numerical value which is what a computer can interpret, these values ranging from 0 (= 0 V) and 1023 (= 5 V).</w:t>
       </w:r>
     </w:p>
     <w:p>
@@ -4021,7 +4204,23 @@
     </w:p>
     <w:p>
       <w:r>
-        <w:t>The Arduno Uno board is a microcontroller, which combines an integrated circuit with some computer processing capabilities enabling user written programming code to be executed on the board. The device has a USB interface which provides power to the board from the PC and allows a two way data connection between the PC and Arduino. The black pins on the board allow wires to be inserted to make electrical connections between circuits and the Arduino board. There are three main types of pins used on this board:</w:t>
+        <w:t xml:space="preserve">The </w:t>
+      </w:r>
+      <w:proofErr w:type="spellStart"/>
+      <w:r>
+        <w:t>Arduno</w:t>
+      </w:r>
+      <w:proofErr w:type="spellEnd"/>
+      <w:r>
+        <w:t xml:space="preserve"> Uno board is a microcontroller, which combines an integrated circuit with some computer processing capabilities enabling user written programming code to be executed on the board. The device has a USB interface which provides power to the board from the PC and allows a </w:t>
+      </w:r>
+      <w:proofErr w:type="gramStart"/>
+      <w:r>
+        <w:t>two way</w:t>
+      </w:r>
+      <w:proofErr w:type="gramEnd"/>
+      <w:r>
+        <w:t xml:space="preserve"> data connection between the PC and Arduino. The black pins on the board allow wires to be inserted to make electrical connections between circuits and the Arduino board. There are three main types of pins used on this board:</w:t>
       </w:r>
     </w:p>
     <w:p>
@@ -4122,7 +4321,15 @@
         </w:numPr>
       </w:pPr>
       <w:r>
-        <w:t>Removing the multimeter and connecting the voltage signal to the Arduino.</w:t>
+        <w:t xml:space="preserve">Removing the </w:t>
+      </w:r>
+      <w:proofErr w:type="spellStart"/>
+      <w:r>
+        <w:t>multimeter</w:t>
+      </w:r>
+      <w:proofErr w:type="spellEnd"/>
+      <w:r>
+        <w:t xml:space="preserve"> and connecting the voltage signal to the Arduino.</w:t>
       </w:r>
     </w:p>
     <w:p>
@@ -4196,7 +4403,15 @@
     </w:p>
     <w:p>
       <w:r>
-        <w:t>The Arduino microcontroller runs a small amount of code to instruct the device with the tasks it needs to undertake. Arduino code is written in using a language derived from C, which uses a different syntax to the Python code used in the rest of the practical. The code deployed to the Arduino has been made available alongside the Python scripts you will use. Principally the code instructs the Arduino to read the voltage value on pin A0 every 100 ms and to stream the values via its serial interface. We will then read the serial stream from the computer using Python.</w:t>
+        <w:t xml:space="preserve">The Arduino microcontroller runs a small amount of code to instruct the device with the tasks it needs to undertake. Arduino code is written in using a language derived from C, which uses a different syntax to the Python code used in the rest of the practical. The code deployed to the Arduino has been made available alongside the Python scripts you will use. Principally the code instructs the Arduino to read the voltage value on pin A0 every 100 </w:t>
+      </w:r>
+      <w:proofErr w:type="spellStart"/>
+      <w:r>
+        <w:t>ms</w:t>
+      </w:r>
+      <w:proofErr w:type="spellEnd"/>
+      <w:r>
+        <w:t xml:space="preserve"> and to stream the values via its serial interface. We will then read the serial stream from the computer using Python.</w:t>
       </w:r>
     </w:p>
     <w:p>
@@ -4209,7 +4424,15 @@
     </w:p>
     <w:p>
       <w:r>
-        <w:t>Before running the scripts used for this practical, it is worth checking that you have a working python environment with all the required packages installed. In order for python to receive data from the Arduino the PySerial package will be used. You should download and run the test python script to check the python installation is correctly function, paying particular attention to the ‘serial’ package being present.</w:t>
+        <w:t xml:space="preserve">Before running the scripts used for this practical, it is worth checking that you have a working python environment with all the required packages installed. In order for python to receive data from the Arduino the </w:t>
+      </w:r>
+      <w:proofErr w:type="spellStart"/>
+      <w:r>
+        <w:t>PySerial</w:t>
+      </w:r>
+      <w:proofErr w:type="spellEnd"/>
+      <w:r>
+        <w:t xml:space="preserve"> package will be used. You should download and run the test python script to check the python installation is correctly function, paying particular attention to the ‘serial’ package being present.</w:t>
       </w:r>
     </w:p>
     <w:p>
@@ -4263,7 +4486,29 @@
         <w:rPr>
           <w:rFonts w:ascii="Courier New" w:hAnsi="Courier New" w:cs="Courier New"/>
         </w:rPr>
-        <w:t>python -m serial.tools.list_ports -v</w:t>
+        <w:t xml:space="preserve">python -m </w:t>
+      </w:r>
+      <w:proofErr w:type="spellStart"/>
+      <w:proofErr w:type="gramStart"/>
+      <w:r>
+        <w:rPr>
+          <w:rFonts w:ascii="Courier New" w:hAnsi="Courier New" w:cs="Courier New"/>
+        </w:rPr>
+        <w:t>serial.tools</w:t>
+      </w:r>
+      <w:proofErr w:type="gramEnd"/>
+      <w:r>
+        <w:rPr>
+          <w:rFonts w:ascii="Courier New" w:hAnsi="Courier New" w:cs="Courier New"/>
+        </w:rPr>
+        <w:t>.list_ports</w:t>
+      </w:r>
+      <w:proofErr w:type="spellEnd"/>
+      <w:r>
+        <w:rPr>
+          <w:rFonts w:ascii="Courier New" w:hAnsi="Courier New" w:cs="Courier New"/>
+        </w:rPr>
+        <w:t xml:space="preserve"> -v</w:t>
       </w:r>
     </w:p>
     <w:p>
@@ -4367,7 +4612,23 @@
     </w:p>
     <w:p>
       <w:r>
-        <w:t>You should see the values being displayed rapidly. This is the realtime list of measurements being received by the computer from the Arduino. Try varying the amount of light reaching the photodiode and see how the values vary. To escape the data stream press Ctrl+C.</w:t>
+        <w:t xml:space="preserve">You should see the values being displayed rapidly. This is the </w:t>
+      </w:r>
+      <w:proofErr w:type="spellStart"/>
+      <w:r>
+        <w:t>realtime</w:t>
+      </w:r>
+      <w:proofErr w:type="spellEnd"/>
+      <w:r>
+        <w:t xml:space="preserve"> list of measurements being received by the computer from the Arduino. Try varying the amount of light reaching the photodiode and see how the values vary. To escape the data stream press </w:t>
+      </w:r>
+      <w:proofErr w:type="spellStart"/>
+      <w:r>
+        <w:t>Ctrl+C</w:t>
+      </w:r>
+      <w:proofErr w:type="spellEnd"/>
+      <w:r>
+        <w:t>.</w:t>
       </w:r>
     </w:p>
     <w:p>
@@ -4452,10 +4713,10 @@
             <v:path o:extrusionok="f" gradientshapeok="t" o:connecttype="rect"/>
             <o:lock v:ext="edit" aspectratio="t"/>
           </v:shapetype>
-          <v:shape id="_x0000_i1030" type="#_x0000_t75" style="width:424.5pt;height:113.25pt" o:ole="">
+          <v:shape id="_x0000_i1025" type="#_x0000_t75" style="width:424.5pt;height:113.25pt" o:ole="">
             <v:imagedata r:id="rId40" o:title=""/>
           </v:shape>
-          <o:OLEObject Type="Embed" ProgID="ChemDraw_x64.Document.6.0" ShapeID="_x0000_i1030" DrawAspect="Content" ObjectID="_1836634294" r:id="rId41"/>
+          <o:OLEObject Type="Embed" ProgID="ChemDraw_x64.Document.6.0" ShapeID="_x0000_i1025" DrawAspect="Content" ObjectID="_1836646590" r:id="rId41"/>
         </w:object>
       </w:r>
     </w:p>
@@ -6587,7 +6848,7 @@
               </wp:anchor>
             </w:drawing>
           </mc:Choice>
-          <mc:Fallback xmlns:oel="http://schemas.microsoft.com/office/2019/extlst" xmlns:w16du="http://schemas.microsoft.com/office/word/2023/wordml/word16du" xmlns:w16sdtfl="http://schemas.microsoft.com/office/word/2024/wordml/sdtformatlock">
+          <mc:Fallback xmlns:w16sdtfl="http://schemas.microsoft.com/office/word/2024/wordml/sdtformatlock" xmlns:w16du="http://schemas.microsoft.com/office/word/2023/wordml/word16du" xmlns:oel="http://schemas.microsoft.com/office/2019/extlst">
             <w:pict>
               <v:group w14:anchorId="1280F12E" id="Group 9" o:spid="_x0000_s1026" alt="A picture of a resistor. A silver wire wrapped in a grey and black covering" style="position:absolute;margin-left:0;margin-top:-.05pt;width:249.85pt;height:88.5pt;z-index:-251656192;mso-position-horizontal:left;mso-position-horizontal-relative:margin" coordsize="31729,11239" o:gfxdata="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">
                 <v:shape id="Picture 10" o:spid="_x0000_s1027" type="#_x0000_t75" alt="IMAG1638" style="position:absolute;width:25717;height:11239;visibility:visible;mso-wrap-style:square" o:gfxdata="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">
@@ -6769,12 +7030,33 @@
         </w:drawing>
       </w:r>
       <w:r>
-        <w:t>Using a multimeter</w:t>
-      </w:r>
-    </w:p>
-    <w:p>
-      <w:r>
-        <w:t xml:space="preserve">The multimeters you are supplied with a capable of measuring various parameters. In this experiment we are interested in measuring voltage and resistance. In order to set up the multimeter for use we need to attach the cables. The black cable goes in the common (ground, </w:t>
+        <w:t xml:space="preserve">Using a </w:t>
+      </w:r>
+      <w:proofErr w:type="spellStart"/>
+      <w:r>
+        <w:t>multimeter</w:t>
+      </w:r>
+      <w:proofErr w:type="spellEnd"/>
+    </w:p>
+    <w:p>
+      <w:r>
+        <w:t xml:space="preserve">The </w:t>
+      </w:r>
+      <w:proofErr w:type="spellStart"/>
+      <w:r>
+        <w:t>multimeters</w:t>
+      </w:r>
+      <w:proofErr w:type="spellEnd"/>
+      <w:r>
+        <w:t xml:space="preserve"> you are supplied with a capable of measuring various parameters. In this experiment we are interested in measuring voltage and resistance. In order to set up the </w:t>
+      </w:r>
+      <w:proofErr w:type="spellStart"/>
+      <w:r>
+        <w:t>multimeter</w:t>
+      </w:r>
+      <w:proofErr w:type="spellEnd"/>
+      <w:r>
+        <w:t xml:space="preserve"> for use we need to attach the cables. The black cable goes in the common (ground, </w:t>
       </w:r>
       <w:r>
         <w:rPr>
@@ -6874,7 +7156,23 @@
         <w:rPr>
           <w:rFonts w:ascii="Nirmala UI" w:hAnsi="Nirmala UI" w:cs="Nirmala UI"/>
         </w:rPr>
-        <w:t xml:space="preserve"> 20 section. The voltage is then measured across the component of interest (eg try testing the power supply is 5 V).</w:t>
+        <w:t xml:space="preserve"> 20 section. The voltage is then measured across the component of interest (</w:t>
+      </w:r>
+      <w:proofErr w:type="spellStart"/>
+      <w:proofErr w:type="gramStart"/>
+      <w:r>
+        <w:rPr>
+          <w:rFonts w:ascii="Nirmala UI" w:hAnsi="Nirmala UI" w:cs="Nirmala UI"/>
+        </w:rPr>
+        <w:t>eg</w:t>
+      </w:r>
+      <w:proofErr w:type="spellEnd"/>
+      <w:proofErr w:type="gramEnd"/>
+      <w:r>
+        <w:rPr>
+          <w:rFonts w:ascii="Nirmala UI" w:hAnsi="Nirmala UI" w:cs="Nirmala UI"/>
+        </w:rPr>
+        <w:t xml:space="preserve"> try testing the power supply is 5 V).</w:t>
       </w:r>
     </w:p>
     <w:p>
@@ -6887,7 +7185,23 @@
     </w:p>
     <w:p>
       <w:r>
-        <w:t>Resistor values can be measured using a multimeter. The multimeters you are supplied with can measure up to 2000 k</w:t>
+        <w:t xml:space="preserve">Resistor values can be measured using a </w:t>
+      </w:r>
+      <w:proofErr w:type="spellStart"/>
+      <w:r>
+        <w:t>multimeter</w:t>
+      </w:r>
+      <w:proofErr w:type="spellEnd"/>
+      <w:r>
+        <w:t xml:space="preserve">. The </w:t>
+      </w:r>
+      <w:proofErr w:type="spellStart"/>
+      <w:r>
+        <w:t>multimeters</w:t>
+      </w:r>
+      <w:proofErr w:type="spellEnd"/>
+      <w:r>
+        <w:t xml:space="preserve"> you are supplied with can measure up to 2000 k</w:t>
       </w:r>
       <w:r>
         <w:rPr>
@@ -6905,7 +7219,25 @@
         <w:t>Ω</w:t>
       </w:r>
       <w:r>
-        <w:t>). If you know what value you are expecting for a resistor, set the multimeter to the value higher (eg for a 100 k</w:t>
+        <w:t xml:space="preserve">). If you know what value you are expecting for a resistor, set the </w:t>
+      </w:r>
+      <w:proofErr w:type="spellStart"/>
+      <w:r>
+        <w:t>multimeter</w:t>
+      </w:r>
+      <w:proofErr w:type="spellEnd"/>
+      <w:r>
+        <w:t xml:space="preserve"> to the value higher (</w:t>
+      </w:r>
+      <w:proofErr w:type="spellStart"/>
+      <w:proofErr w:type="gramStart"/>
+      <w:r>
+        <w:t>eg</w:t>
+      </w:r>
+      <w:proofErr w:type="spellEnd"/>
+      <w:proofErr w:type="gramEnd"/>
+      <w:r>
+        <w:t xml:space="preserve"> for a 100 k</w:t>
       </w:r>
       <w:r>
         <w:rPr>
@@ -6940,7 +7272,25 @@
         <w:jc w:val="both"/>
       </w:pPr>
       <w:r>
-        <w:t>If you have an unknown resistor, set the multimeter to the highest resistance (2000k) and read the value. Change through the values until the meter displays sensible precision. If the meter is showing 000, the resistance is too small for that scale. If the meter is reading 1, the resistance is too high for the meter (eg a 10 M</w:t>
+        <w:t xml:space="preserve">If you have an unknown resistor, set the </w:t>
+      </w:r>
+      <w:proofErr w:type="spellStart"/>
+      <w:r>
+        <w:t>multimeter</w:t>
+      </w:r>
+      <w:proofErr w:type="spellEnd"/>
+      <w:r>
+        <w:t xml:space="preserve"> to the highest resistance (2000k) and read the value. Change through the values until the meter displays sensible precision. If the meter is showing 000, the resistance is too small for that scale. If the meter is reading 1, the resistance is too high for the meter (</w:t>
+      </w:r>
+      <w:proofErr w:type="spellStart"/>
+      <w:proofErr w:type="gramStart"/>
+      <w:r>
+        <w:t>eg</w:t>
+      </w:r>
+      <w:proofErr w:type="spellEnd"/>
+      <w:proofErr w:type="gramEnd"/>
+      <w:r>
+        <w:t xml:space="preserve"> a 10 M</w:t>
       </w:r>
       <w:r>
         <w:rPr>
@@ -7028,7 +7378,7 @@
       <w:spacing w:after="240"/>
     </w:pPr>
     <w:r>
-      <w:t>ART5: Building and Calibrating a Photometer</w:t>
+      <w:t>Building and Calibrating a Photometer</w:t>
     </w:r>
   </w:p>
 </w:hdr>
@@ -7045,7 +7395,7 @@
       <w:spacing w:after="240"/>
     </w:pPr>
     <w:r>
-      <w:t>ART5: Building and Calibrating a Photometer</w:t>
+      <w:t>Building and Calibrating a Photometer</w:t>
     </w:r>
   </w:p>
 </w:hdr>

</xml_diff>